<commit_message>
Deutsch 7A: Aufgaben-Präsentation und Merksatz Partizip II ergänzt
Merksatz 5 nennt jetzt, wofür das Partizip II gebraucht wird (Perfekt
mit haben/sein). Neue PowerPoint zeigt nur die Übungen der Stunde im
selben Format wie an der Tafel, Lösungen in den Notizen.

Co-Authored-By: Claude Opus 5.5 <noreply@anthropic.com>
Claude-Session: https://claude.ai/code/session_01KXvLXHMYPnCyEbMRgNaaYs
</commit_message>
<xml_diff>
--- a/Deutsch_7A/Verbformen_verstehen/Tafelskript_Verbformen_verstehen.docx
+++ b/Deutsch_7A/Verbformen_verstehen/Tafelskript_Verbformen_verstehen.docx
@@ -1981,7 +1981,7 @@
                 <w:sz w:val="20"/>
                 <w:szCs w:val="20"/>
               </w:rPr>
-              <w:t xml:space="preserve">Partizip II</w:t>
+              <w:t xml:space="preserve">Partizip II: Bildung, wofür man es braucht, Test</w:t>
             </w:r>
           </w:p>
         </w:tc>
@@ -10833,6 +10833,20 @@
               <w:t xml:space="preserve">ge-…-t und ge-…-en herausarbeiten. Test zeigen: Passt „ich habe …“ oder „ich bin …“ davor?</w:t>
             </w:r>
           </w:p>
+          <w:p>
+            <w:pPr>
+              <w:spacing w:after="50" w:before="0"/>
+            </w:pPr>
+            <w:r>
+              <w:rPr>
+                <w:rFonts w:ascii="Calibri" w:cs="Calibri" w:eastAsia="Calibri" w:hAnsi="Calibri"/>
+                <w:color w:val="000000"/>
+                <w:sz w:val="21"/>
+                <w:szCs w:val="21"/>
+              </w:rPr>
+              <w:t xml:space="preserve">Dann fragen: „Wofür brauchen wir diese Form?“ → Damit haben wir gerade vom Wochenende erzählt, also von etwas, das schon passiert ist.</w:t>
+            </w:r>
+          </w:p>
         </w:tc>
       </w:tr>
     </w:tbl>
@@ -11087,7 +11101,47 @@
                       <w:sz w:val="21"/>
                       <w:szCs w:val="21"/>
                     </w:rPr>
-                    <w:t xml:space="preserve">. Man bildet es meist mit ge-…-t (gespielt) oder ge-…-en (gelaufen). Test: Passt „ich habe …“ oder „ich bin …“ davor?</w:t>
+                    <w:t xml:space="preserve">. Man bildet es meist mit ge-…-t (gespielt) oder ge-…-en (gelaufen). </w:t>
+                  </w:r>
+                  <w:r>
+                    <w:rPr>
+                      <w:rFonts w:ascii="Calibri" w:cs="Calibri" w:eastAsia="Calibri" w:hAnsi="Calibri"/>
+                      <w:b/>
+                      <w:bCs/>
+                      <w:color w:val="000000"/>
+                      <w:sz w:val="21"/>
+                      <w:szCs w:val="21"/>
+                    </w:rPr>
+                    <w:t xml:space="preserve">Wofür? </w:t>
+                  </w:r>
+                  <w:r>
+                    <w:rPr>
+                      <w:rFonts w:ascii="Calibri" w:cs="Calibri" w:eastAsia="Calibri" w:hAnsi="Calibri"/>
+                      <w:color w:val="000000"/>
+                      <w:sz w:val="21"/>
+                      <w:szCs w:val="21"/>
+                    </w:rPr>
+                    <w:t xml:space="preserve">Mit haben oder sein erzähle ich, was schon passiert ist (Perfekt): Ich habe gespielt. Ich bin gelaufen. </w:t>
+                  </w:r>
+                  <w:r>
+                    <w:rPr>
+                      <w:rFonts w:ascii="Calibri" w:cs="Calibri" w:eastAsia="Calibri" w:hAnsi="Calibri"/>
+                      <w:b/>
+                      <w:bCs/>
+                      <w:color w:val="000000"/>
+                      <w:sz w:val="21"/>
+                      <w:szCs w:val="21"/>
+                    </w:rPr>
+                    <w:t xml:space="preserve">Test: </w:t>
+                  </w:r>
+                  <w:r>
+                    <w:rPr>
+                      <w:rFonts w:ascii="Calibri" w:cs="Calibri" w:eastAsia="Calibri" w:hAnsi="Calibri"/>
+                      <w:color w:val="000000"/>
+                      <w:sz w:val="21"/>
+                      <w:szCs w:val="21"/>
+                    </w:rPr>
+                    <w:t xml:space="preserve">Passt „ich habe …“ oder „ich bin …“ davor?</w:t>
                   </w:r>
                 </w:p>
               </w:tc>
@@ -12584,7 +12638,7 @@
                       <w:sz w:val="21"/>
                       <w:szCs w:val="21"/>
                     </w:rPr>
-                    <w:t xml:space="preserve">Schreibe untereinander nur die Nummer und das fehlende Wort: habe, hat, bin, ist oder sind.</w:t>
+                    <w:t xml:space="preserve">Schreibe nur Nummer + Wort: habe, hat, bin, ist oder sind.</w:t>
                   </w:r>
                 </w:p>
                 <w:p>

</xml_diff>

<commit_message>
Deutsch 7A: Merksätze auf die Folien
Die sieben Merksätze stehen jetzt als eigene Folien in der Präsentation
(roter Rahmen, Beispiel in Farbe, Wofür und Test), jeweils vor der
passenden Übung. Das Tafelskript verweist bei den Merksätzen auf die
Folie. CLAUDE.md und Reflexionslog ergänzt.

Co-Authored-By: Claude Opus 5.5 <noreply@anthropic.com>
Claude-Session: https://claude.ai/code/session_01KXvLXHMYPnCyEbMRgNaaYs
</commit_message>
<xml_diff>
--- a/Deutsch_7A/Verbformen_verstehen/Tafelskript_Verbformen_verstehen.docx
+++ b/Deutsch_7A/Verbformen_verstehen/Tafelskript_Verbformen_verstehen.docx
@@ -45,7 +45,7 @@
           <w:sz w:val="21"/>
           <w:szCs w:val="21"/>
         </w:rPr>
-        <w:t xml:space="preserve">Ohne Arbeitsblatt: Alles entsteht an der Tafel, die Klasse schreibt ins Heft. Klarheit entsteht durch zwei Dinge: eine eindeutige Ansage bei jedem Wechsel und Übungen, die an der Tafel immer im gleichen Format stehen.</w:t>
+        <w:t xml:space="preserve">Ohne Arbeitsblatt: Tafelbilder und Tabellen entstehen an der Tafel, Merksätze und Übungen stehen auf der Folie, die Klasse schreibt ins Heft. Klarheit entsteht durch zwei Dinge: eine eindeutige Ansage bei jedem Wechsel und Übungen, die an der Tafel immer im gleichen Format stehen.</w:t>
       </w:r>
     </w:p>
     <w:p>
@@ -1184,7 +1184,7 @@
                 <w:sz w:val="19"/>
                 <w:szCs w:val="19"/>
               </w:rPr>
-              <w:t xml:space="preserve">Tafelbild und Merksätze der aktuellen Phase</w:t>
+              <w:t xml:space="preserve">Tafelbild der aktuellen Phase (Merksätze kommen von der Folie)</w:t>
             </w:r>
           </w:p>
           <w:p>
@@ -3931,7 +3931,7 @@
                 <w:sz w:val="21"/>
                 <w:szCs w:val="21"/>
               </w:rPr>
-              <w:t xml:space="preserve">„Jetzt schreibt ihr ab: Merksatz 1 und Merksatz 2. Rahmt jeden Merksatz mit Rot ein.“</w:t>
+              <w:t xml:space="preserve">„Jetzt schreibt ihr von der Folie ab: Merksatz 1 und Merksatz 2. Rahmt jeden Merksatz mit Rot ein.“</w:t>
             </w:r>
           </w:p>
           <w:tbl>
@@ -3957,12 +3957,12 @@
                 <w:tcPr>
                   <w:tcW w:type="dxa" w:w="8166"/>
                   <w:tcBorders>
-                    <w:top w:val="single" w:color="3D4A3F" w:sz="12"/>
-                    <w:left w:val="single" w:color="3D4A3F" w:sz="12"/>
-                    <w:bottom w:val="single" w:color="3D4A3F" w:sz="12"/>
-                    <w:right w:val="single" w:color="3D4A3F" w:sz="12"/>
+                    <w:top w:val="single" w:color="1E2761" w:sz="12"/>
+                    <w:left w:val="single" w:color="1E2761" w:sz="12"/>
+                    <w:bottom w:val="single" w:color="1E2761" w:sz="12"/>
+                    <w:right w:val="single" w:color="1E2761" w:sz="12"/>
                   </w:tcBorders>
-                  <w:shd w:fill="3D4A3F" w:color="auto" w:val="clear"/>
+                  <w:shd w:fill="1E2761" w:color="auto" w:val="clear"/>
                   <w:tcMar>
                     <w:top w:type="dxa" w:w="30"/>
                     <w:left w:type="dxa" w:w="100"/>
@@ -3984,7 +3984,7 @@
                       <w:sz w:val="16"/>
                       <w:szCs w:val="16"/>
                     </w:rPr>
-                    <w:t xml:space="preserve">TAFEL · Merksatz 1 (rot umrahmen)</w:t>
+                    <w:t xml:space="preserve">FOLIE · Merksatz 1 – abschreiben, rot umrahmen</w:t>
                   </w:r>
                 </w:p>
               </w:tc>
@@ -3997,12 +3997,12 @@
                 <w:tcPr>
                   <w:tcW w:type="dxa" w:w="8166"/>
                   <w:tcBorders>
-                    <w:top w:val="single" w:color="3D4A3F" w:sz="12"/>
-                    <w:left w:val="single" w:color="3D4A3F" w:sz="12"/>
-                    <w:bottom w:val="single" w:color="3D4A3F" w:sz="12"/>
-                    <w:right w:val="single" w:color="3D4A3F" w:sz="12"/>
+                    <w:top w:val="single" w:color="1E2761" w:sz="12"/>
+                    <w:left w:val="single" w:color="1E2761" w:sz="12"/>
+                    <w:bottom w:val="single" w:color="1E2761" w:sz="12"/>
+                    <w:right w:val="single" w:color="1E2761" w:sz="12"/>
                   </w:tcBorders>
-                  <w:shd w:fill="F3F6F1" w:color="auto" w:val="clear"/>
+                  <w:shd w:fill="F4F7FD" w:color="auto" w:val="clear"/>
                   <w:tcMar>
                     <w:top w:type="dxa" w:w="100"/>
                     <w:left w:type="dxa" w:w="160"/>
@@ -4141,12 +4141,12 @@
                 <w:tcPr>
                   <w:tcW w:type="dxa" w:w="8166"/>
                   <w:tcBorders>
-                    <w:top w:val="single" w:color="3D4A3F" w:sz="12"/>
-                    <w:left w:val="single" w:color="3D4A3F" w:sz="12"/>
-                    <w:bottom w:val="single" w:color="3D4A3F" w:sz="12"/>
-                    <w:right w:val="single" w:color="3D4A3F" w:sz="12"/>
+                    <w:top w:val="single" w:color="1E2761" w:sz="12"/>
+                    <w:left w:val="single" w:color="1E2761" w:sz="12"/>
+                    <w:bottom w:val="single" w:color="1E2761" w:sz="12"/>
+                    <w:right w:val="single" w:color="1E2761" w:sz="12"/>
                   </w:tcBorders>
-                  <w:shd w:fill="3D4A3F" w:color="auto" w:val="clear"/>
+                  <w:shd w:fill="1E2761" w:color="auto" w:val="clear"/>
                   <w:tcMar>
                     <w:top w:type="dxa" w:w="30"/>
                     <w:left w:type="dxa" w:w="100"/>
@@ -4168,7 +4168,7 @@
                       <w:sz w:val="16"/>
                       <w:szCs w:val="16"/>
                     </w:rPr>
-                    <w:t xml:space="preserve">TAFEL · Merksatz 2 (rot umrahmen)</w:t>
+                    <w:t xml:space="preserve">FOLIE · Merksatz 2 – abschreiben, rot umrahmen</w:t>
                   </w:r>
                 </w:p>
               </w:tc>
@@ -4181,12 +4181,12 @@
                 <w:tcPr>
                   <w:tcW w:type="dxa" w:w="8166"/>
                   <w:tcBorders>
-                    <w:top w:val="single" w:color="3D4A3F" w:sz="12"/>
-                    <w:left w:val="single" w:color="3D4A3F" w:sz="12"/>
-                    <w:bottom w:val="single" w:color="3D4A3F" w:sz="12"/>
-                    <w:right w:val="single" w:color="3D4A3F" w:sz="12"/>
+                    <w:top w:val="single" w:color="1E2761" w:sz="12"/>
+                    <w:left w:val="single" w:color="1E2761" w:sz="12"/>
+                    <w:bottom w:val="single" w:color="1E2761" w:sz="12"/>
+                    <w:right w:val="single" w:color="1E2761" w:sz="12"/>
                   </w:tcBorders>
-                  <w:shd w:fill="F3F6F1" w:color="auto" w:val="clear"/>
+                  <w:shd w:fill="F4F7FD" w:color="auto" w:val="clear"/>
                   <w:tcMar>
                     <w:top w:type="dxa" w:w="100"/>
                     <w:left w:type="dxa" w:w="160"/>
@@ -6758,7 +6758,7 @@
                 <w:sz w:val="21"/>
                 <w:szCs w:val="21"/>
               </w:rPr>
-              <w:t xml:space="preserve">„Jetzt schreibt ihr ab: Merksatz 3. Dann zeichnet ihr die Tabelle mit Lineal ab – auch die leeren Spalten! Die füllen wir später.“</w:t>
+              <w:t xml:space="preserve">„Jetzt schreibt ihr von der Folie ab: Merksatz 3. Dann zeichnet ihr die Tabelle von der Tafel mit Lineal ab – auch die leeren Spalten! Die füllen wir später.“</w:t>
             </w:r>
           </w:p>
           <w:tbl>
@@ -6784,12 +6784,12 @@
                 <w:tcPr>
                   <w:tcW w:type="dxa" w:w="8166"/>
                   <w:tcBorders>
-                    <w:top w:val="single" w:color="3D4A3F" w:sz="12"/>
-                    <w:left w:val="single" w:color="3D4A3F" w:sz="12"/>
-                    <w:bottom w:val="single" w:color="3D4A3F" w:sz="12"/>
-                    <w:right w:val="single" w:color="3D4A3F" w:sz="12"/>
+                    <w:top w:val="single" w:color="1E2761" w:sz="12"/>
+                    <w:left w:val="single" w:color="1E2761" w:sz="12"/>
+                    <w:bottom w:val="single" w:color="1E2761" w:sz="12"/>
+                    <w:right w:val="single" w:color="1E2761" w:sz="12"/>
                   </w:tcBorders>
-                  <w:shd w:fill="3D4A3F" w:color="auto" w:val="clear"/>
+                  <w:shd w:fill="1E2761" w:color="auto" w:val="clear"/>
                   <w:tcMar>
                     <w:top w:type="dxa" w:w="30"/>
                     <w:left w:type="dxa" w:w="100"/>
@@ -6811,7 +6811,7 @@
                       <w:sz w:val="16"/>
                       <w:szCs w:val="16"/>
                     </w:rPr>
-                    <w:t xml:space="preserve">TAFEL · Merksatz 3 (rot umrahmen)</w:t>
+                    <w:t xml:space="preserve">FOLIE · Merksatz 3 – abschreiben, rot umrahmen</w:t>
                   </w:r>
                 </w:p>
               </w:tc>
@@ -6824,12 +6824,12 @@
                 <w:tcPr>
                   <w:tcW w:type="dxa" w:w="8166"/>
                   <w:tcBorders>
-                    <w:top w:val="single" w:color="3D4A3F" w:sz="12"/>
-                    <w:left w:val="single" w:color="3D4A3F" w:sz="12"/>
-                    <w:bottom w:val="single" w:color="3D4A3F" w:sz="12"/>
-                    <w:right w:val="single" w:color="3D4A3F" w:sz="12"/>
+                    <w:top w:val="single" w:color="1E2761" w:sz="12"/>
+                    <w:left w:val="single" w:color="1E2761" w:sz="12"/>
+                    <w:bottom w:val="single" w:color="1E2761" w:sz="12"/>
+                    <w:right w:val="single" w:color="1E2761" w:sz="12"/>
                   </w:tcBorders>
-                  <w:shd w:fill="F3F6F1" w:color="auto" w:val="clear"/>
+                  <w:shd w:fill="F4F7FD" w:color="auto" w:val="clear"/>
                   <w:tcMar>
                     <w:top w:type="dxa" w:w="100"/>
                     <w:left w:type="dxa" w:w="160"/>
@@ -9444,7 +9444,7 @@
                 <w:sz w:val="21"/>
                 <w:szCs w:val="21"/>
               </w:rPr>
-              <w:t xml:space="preserve">„Jetzt schreibt ihr ab: Füllt in eurem Heft die leeren Spalten der Tabelle aus. Dann Merksatz 4.“</w:t>
+              <w:t xml:space="preserve">„Jetzt schreibt ihr ab: Füllt in eurem Heft die leeren Spalten der Tabelle aus. Dann schreibt ihr von der Folie Merksatz 4 ab.“</w:t>
             </w:r>
           </w:p>
           <w:tbl>
@@ -9470,12 +9470,12 @@
                 <w:tcPr>
                   <w:tcW w:type="dxa" w:w="8166"/>
                   <w:tcBorders>
-                    <w:top w:val="single" w:color="3D4A3F" w:sz="12"/>
-                    <w:left w:val="single" w:color="3D4A3F" w:sz="12"/>
-                    <w:bottom w:val="single" w:color="3D4A3F" w:sz="12"/>
-                    <w:right w:val="single" w:color="3D4A3F" w:sz="12"/>
+                    <w:top w:val="single" w:color="1E2761" w:sz="12"/>
+                    <w:left w:val="single" w:color="1E2761" w:sz="12"/>
+                    <w:bottom w:val="single" w:color="1E2761" w:sz="12"/>
+                    <w:right w:val="single" w:color="1E2761" w:sz="12"/>
                   </w:tcBorders>
-                  <w:shd w:fill="3D4A3F" w:color="auto" w:val="clear"/>
+                  <w:shd w:fill="1E2761" w:color="auto" w:val="clear"/>
                   <w:tcMar>
                     <w:top w:type="dxa" w:w="30"/>
                     <w:left w:type="dxa" w:w="100"/>
@@ -9497,7 +9497,7 @@
                       <w:sz w:val="16"/>
                       <w:szCs w:val="16"/>
                     </w:rPr>
-                    <w:t xml:space="preserve">TAFEL · Merksatz 4 (rot umrahmen)</w:t>
+                    <w:t xml:space="preserve">FOLIE · Merksatz 4 – abschreiben, rot umrahmen</w:t>
                   </w:r>
                 </w:p>
               </w:tc>
@@ -9510,12 +9510,12 @@
                 <w:tcPr>
                   <w:tcW w:type="dxa" w:w="8166"/>
                   <w:tcBorders>
-                    <w:top w:val="single" w:color="3D4A3F" w:sz="12"/>
-                    <w:left w:val="single" w:color="3D4A3F" w:sz="12"/>
-                    <w:bottom w:val="single" w:color="3D4A3F" w:sz="12"/>
-                    <w:right w:val="single" w:color="3D4A3F" w:sz="12"/>
+                    <w:top w:val="single" w:color="1E2761" w:sz="12"/>
+                    <w:left w:val="single" w:color="1E2761" w:sz="12"/>
+                    <w:bottom w:val="single" w:color="1E2761" w:sz="12"/>
+                    <w:right w:val="single" w:color="1E2761" w:sz="12"/>
                   </w:tcBorders>
-                  <w:shd w:fill="F3F6F1" w:color="auto" w:val="clear"/>
+                  <w:shd w:fill="F4F7FD" w:color="auto" w:val="clear"/>
                   <w:tcMar>
                     <w:top w:type="dxa" w:w="100"/>
                     <w:left w:type="dxa" w:w="160"/>
@@ -11723,7 +11723,7 @@
                 <w:sz w:val="21"/>
                 <w:szCs w:val="21"/>
               </w:rPr>
-              <w:t xml:space="preserve">„Jetzt schreibt ihr ab: Merksatz 5. Rot umrahmen.“</w:t>
+              <w:t xml:space="preserve">„Jetzt schreibt ihr von der Folie ab: Merksatz 5. Rot umrahmen.“</w:t>
             </w:r>
           </w:p>
           <w:tbl>
@@ -11749,12 +11749,12 @@
                 <w:tcPr>
                   <w:tcW w:type="dxa" w:w="8166"/>
                   <w:tcBorders>
-                    <w:top w:val="single" w:color="3D4A3F" w:sz="12"/>
-                    <w:left w:val="single" w:color="3D4A3F" w:sz="12"/>
-                    <w:bottom w:val="single" w:color="3D4A3F" w:sz="12"/>
-                    <w:right w:val="single" w:color="3D4A3F" w:sz="12"/>
+                    <w:top w:val="single" w:color="1E2761" w:sz="12"/>
+                    <w:left w:val="single" w:color="1E2761" w:sz="12"/>
+                    <w:bottom w:val="single" w:color="1E2761" w:sz="12"/>
+                    <w:right w:val="single" w:color="1E2761" w:sz="12"/>
                   </w:tcBorders>
-                  <w:shd w:fill="3D4A3F" w:color="auto" w:val="clear"/>
+                  <w:shd w:fill="1E2761" w:color="auto" w:val="clear"/>
                   <w:tcMar>
                     <w:top w:type="dxa" w:w="30"/>
                     <w:left w:type="dxa" w:w="100"/>
@@ -11776,7 +11776,7 @@
                       <w:sz w:val="16"/>
                       <w:szCs w:val="16"/>
                     </w:rPr>
-                    <w:t xml:space="preserve">TAFEL · Merksatz 5 (rot umrahmen)</w:t>
+                    <w:t xml:space="preserve">FOLIE · Merksatz 5 – abschreiben, rot umrahmen</w:t>
                   </w:r>
                 </w:p>
               </w:tc>
@@ -11789,12 +11789,12 @@
                 <w:tcPr>
                   <w:tcW w:type="dxa" w:w="8166"/>
                   <w:tcBorders>
-                    <w:top w:val="single" w:color="3D4A3F" w:sz="12"/>
-                    <w:left w:val="single" w:color="3D4A3F" w:sz="12"/>
-                    <w:bottom w:val="single" w:color="3D4A3F" w:sz="12"/>
-                    <w:right w:val="single" w:color="3D4A3F" w:sz="12"/>
+                    <w:top w:val="single" w:color="1E2761" w:sz="12"/>
+                    <w:left w:val="single" w:color="1E2761" w:sz="12"/>
+                    <w:bottom w:val="single" w:color="1E2761" w:sz="12"/>
+                    <w:right w:val="single" w:color="1E2761" w:sz="12"/>
                   </w:tcBorders>
-                  <w:shd w:fill="F3F6F1" w:color="auto" w:val="clear"/>
+                  <w:shd w:fill="F4F7FD" w:color="auto" w:val="clear"/>
                   <w:tcMar>
                     <w:top w:type="dxa" w:w="100"/>
                     <w:left w:type="dxa" w:w="160"/>
@@ -12806,7 +12806,7 @@
                 <w:sz w:val="21"/>
                 <w:szCs w:val="21"/>
               </w:rPr>
-              <w:t xml:space="preserve">„Jetzt schreibt ihr ab: Merksatz 6. Darunter je einen Beispielsatz: einen mit haben, einen mit sein – in Farbe.“</w:t>
+              <w:t xml:space="preserve">„Jetzt schreibt ihr von der Folie ab: Merksatz 6 mit den beiden Beispielsätzen – in Farbe.“</w:t>
             </w:r>
           </w:p>
           <w:tbl>
@@ -12832,12 +12832,12 @@
                 <w:tcPr>
                   <w:tcW w:type="dxa" w:w="8166"/>
                   <w:tcBorders>
-                    <w:top w:val="single" w:color="3D4A3F" w:sz="12"/>
-                    <w:left w:val="single" w:color="3D4A3F" w:sz="12"/>
-                    <w:bottom w:val="single" w:color="3D4A3F" w:sz="12"/>
-                    <w:right w:val="single" w:color="3D4A3F" w:sz="12"/>
+                    <w:top w:val="single" w:color="1E2761" w:sz="12"/>
+                    <w:left w:val="single" w:color="1E2761" w:sz="12"/>
+                    <w:bottom w:val="single" w:color="1E2761" w:sz="12"/>
+                    <w:right w:val="single" w:color="1E2761" w:sz="12"/>
                   </w:tcBorders>
-                  <w:shd w:fill="3D4A3F" w:color="auto" w:val="clear"/>
+                  <w:shd w:fill="1E2761" w:color="auto" w:val="clear"/>
                   <w:tcMar>
                     <w:top w:type="dxa" w:w="30"/>
                     <w:left w:type="dxa" w:w="100"/>
@@ -12859,7 +12859,7 @@
                       <w:sz w:val="16"/>
                       <w:szCs w:val="16"/>
                     </w:rPr>
-                    <w:t xml:space="preserve">TAFEL · Merksatz 6 (rot umrahmen)</w:t>
+                    <w:t xml:space="preserve">FOLIE · Merksatz 6 – abschreiben, rot umrahmen</w:t>
                   </w:r>
                 </w:p>
               </w:tc>
@@ -12872,12 +12872,12 @@
                 <w:tcPr>
                   <w:tcW w:type="dxa" w:w="8166"/>
                   <w:tcBorders>
-                    <w:top w:val="single" w:color="3D4A3F" w:sz="12"/>
-                    <w:left w:val="single" w:color="3D4A3F" w:sz="12"/>
-                    <w:bottom w:val="single" w:color="3D4A3F" w:sz="12"/>
-                    <w:right w:val="single" w:color="3D4A3F" w:sz="12"/>
+                    <w:top w:val="single" w:color="1E2761" w:sz="12"/>
+                    <w:left w:val="single" w:color="1E2761" w:sz="12"/>
+                    <w:bottom w:val="single" w:color="1E2761" w:sz="12"/>
+                    <w:right w:val="single" w:color="1E2761" w:sz="12"/>
                   </w:tcBorders>
-                  <w:shd w:fill="F3F6F1" w:color="auto" w:val="clear"/>
+                  <w:shd w:fill="F4F7FD" w:color="auto" w:val="clear"/>
                   <w:tcMar>
                     <w:top w:type="dxa" w:w="100"/>
                     <w:left w:type="dxa" w:w="160"/>
@@ -14238,7 +14238,7 @@
                 <w:sz w:val="21"/>
                 <w:szCs w:val="21"/>
               </w:rPr>
-              <w:t xml:space="preserve">„Jetzt schreibt ihr ab: Merksatz 7 und die beiden Beispielsätze.“</w:t>
+              <w:t xml:space="preserve">„Jetzt schreibt ihr von der Folie ab: Merksatz 7 mit den beiden Beispielsätzen.“</w:t>
             </w:r>
           </w:p>
           <w:tbl>
@@ -14264,12 +14264,12 @@
                 <w:tcPr>
                   <w:tcW w:type="dxa" w:w="8166"/>
                   <w:tcBorders>
-                    <w:top w:val="single" w:color="3D4A3F" w:sz="12"/>
-                    <w:left w:val="single" w:color="3D4A3F" w:sz="12"/>
-                    <w:bottom w:val="single" w:color="3D4A3F" w:sz="12"/>
-                    <w:right w:val="single" w:color="3D4A3F" w:sz="12"/>
+                    <w:top w:val="single" w:color="1E2761" w:sz="12"/>
+                    <w:left w:val="single" w:color="1E2761" w:sz="12"/>
+                    <w:bottom w:val="single" w:color="1E2761" w:sz="12"/>
+                    <w:right w:val="single" w:color="1E2761" w:sz="12"/>
                   </w:tcBorders>
-                  <w:shd w:fill="3D4A3F" w:color="auto" w:val="clear"/>
+                  <w:shd w:fill="1E2761" w:color="auto" w:val="clear"/>
                   <w:tcMar>
                     <w:top w:type="dxa" w:w="30"/>
                     <w:left w:type="dxa" w:w="100"/>
@@ -14291,7 +14291,7 @@
                       <w:sz w:val="16"/>
                       <w:szCs w:val="16"/>
                     </w:rPr>
-                    <w:t xml:space="preserve">TAFEL · Merksatz 7 (rot umrahmen)</w:t>
+                    <w:t xml:space="preserve">FOLIE · Merksatz 7 – abschreiben, rot umrahmen</w:t>
                   </w:r>
                 </w:p>
               </w:tc>
@@ -14304,12 +14304,12 @@
                 <w:tcPr>
                   <w:tcW w:type="dxa" w:w="8166"/>
                   <w:tcBorders>
-                    <w:top w:val="single" w:color="3D4A3F" w:sz="12"/>
-                    <w:left w:val="single" w:color="3D4A3F" w:sz="12"/>
-                    <w:bottom w:val="single" w:color="3D4A3F" w:sz="12"/>
-                    <w:right w:val="single" w:color="3D4A3F" w:sz="12"/>
+                    <w:top w:val="single" w:color="1E2761" w:sz="12"/>
+                    <w:left w:val="single" w:color="1E2761" w:sz="12"/>
+                    <w:bottom w:val="single" w:color="1E2761" w:sz="12"/>
+                    <w:right w:val="single" w:color="1E2761" w:sz="12"/>
                   </w:tcBorders>
-                  <w:shd w:fill="F3F6F1" w:color="auto" w:val="clear"/>
+                  <w:shd w:fill="F4F7FD" w:color="auto" w:val="clear"/>
                   <w:tcMar>
                     <w:top w:type="dxa" w:w="100"/>
                     <w:left w:type="dxa" w:w="160"/>

</xml_diff>

<commit_message>
Deutsch 7A: Zusatzblatt „Schon fertig?“ für schnelle Schüler
Ein Blatt zum Drucken: vorne fünf Profi-Aufgaben (Fehleranalyse,
Perfekt bilden, eigene Sätze, Partizip-Regel, Vergleich mit Englisch),
hinten Lösungen zur Selbstkontrolle. Tafelskript und Reflexionslog
verweisen darauf.

Co-Authored-By: Claude Opus 5.5 <noreply@anthropic.com>
Claude-Session: https://claude.ai/code/session_01KXvLXHMYPnCyEbMRgNaaYs
</commit_message>
<xml_diff>
--- a/Deutsch_7A/Verbformen_verstehen/Tafelskript_Verbformen_verstehen.docx
+++ b/Deutsch_7A/Verbformen_verstehen/Tafelskript_Verbformen_verstehen.docx
@@ -568,7 +568,7 @@
           <w:sz w:val="21"/>
           <w:szCs w:val="21"/>
         </w:rPr>
-        <w:t xml:space="preserve">Wer fertig ist, legt den Stift hin. So sehen Sie, wann alle so weit sind – erst dann wird gewischt oder weitergemacht.</w:t>
+        <w:t xml:space="preserve">Wer fertig ist, legt den Stift hin. Wer immer wieder deutlich früher fertig ist, nimmt sich das Zusatzblatt „Schon fertig?“ und arbeitet daran still weiter. So sehen Sie, wann alle so weit sind – erst dann wird gewischt oder weitergemacht.</w:t>
       </w:r>
     </w:p>
     <w:p>
@@ -1277,7 +1277,7 @@
           <w:sz w:val="21"/>
           <w:szCs w:val="21"/>
         </w:rPr>
-        <w:t xml:space="preserve">Kreide/Stifte in Rot, Gelb, Blau, Grün · Schüler: Heft, Lineal, Buntstifte Rot, Gelb, Blau, Grün, kleiner Zettel für das Exit-Ticket · Beamer für die Aufgaben-Präsentation</w:t>
+        <w:t xml:space="preserve">Kreide/Stifte in Rot, Gelb, Blau, Grün · Schüler: Heft, Lineal, Buntstifte Rot, Gelb, Blau, Grün, kleiner Zettel für das Exit-Ticket · Beamer für die Präsentation · Zusatzblatt „Schon fertig?“ für Schnelle (doppelseitig: vorne Aufgaben, hinten Lösungen)</w:t>
       </w:r>
     </w:p>
     <w:p>

</xml_diff>